<commit_message>
updated agenda - added GrowthHub session
</commit_message>
<xml_diff>
--- a/unit-0/paneltalk-agenda/agenda.docx
+++ b/unit-0/paneltalk-agenda/agenda.docx
@@ -11,15 +11,15 @@
           <wp:anchor distT="0" distB="0" distL="114300" distR="114300" simplePos="0" relativeHeight="251658240" behindDoc="0" locked="0" layoutInCell="1" allowOverlap="1">
             <wp:simplePos x="0" y="0"/>
             <wp:positionH relativeFrom="column">
-              <wp:posOffset>-25400</wp:posOffset>
+              <wp:posOffset>698500</wp:posOffset>
             </wp:positionH>
             <wp:positionV relativeFrom="paragraph">
-              <wp:posOffset>-876300</wp:posOffset>
+              <wp:posOffset>0</wp:posOffset>
             </wp:positionV>
-            <wp:extent cx="8394700" cy="7835053"/>
-            <wp:effectExtent l="0" t="0" r="0" b="1270"/>
-            <wp:wrapNone/>
-            <wp:docPr id="1223352977" name="Picture 1"/>
+            <wp:extent cx="7919371" cy="7282180"/>
+            <wp:effectExtent l="0" t="0" r="5715" b="0"/>
+            <wp:wrapSquare wrapText="bothSides"/>
+            <wp:docPr id="2004174078" name="Picture 1"/>
             <wp:cNvGraphicFramePr>
               <a:graphicFrameLocks xmlns:a="http://schemas.openxmlformats.org/drawingml/2006/main" noChangeAspect="1"/>
             </wp:cNvGraphicFramePr>
@@ -27,7 +27,7 @@
               <a:graphicData uri="http://schemas.openxmlformats.org/drawingml/2006/picture">
                 <pic:pic xmlns:pic="http://schemas.openxmlformats.org/drawingml/2006/picture">
                   <pic:nvPicPr>
-                    <pic:cNvPr id="1223352977" name="Picture 1223352977"/>
+                    <pic:cNvPr id="2004174078" name="Picture 2004174078"/>
                     <pic:cNvPicPr/>
                   </pic:nvPicPr>
                   <pic:blipFill>
@@ -45,7 +45,7 @@
                   <pic:spPr>
                     <a:xfrm>
                       <a:off x="0" y="0"/>
-                      <a:ext cx="8394700" cy="7835053"/>
+                      <a:ext cx="7919371" cy="7282180"/>
                     </a:xfrm>
                     <a:prstGeom prst="rect">
                       <a:avLst/>
@@ -66,7 +66,7 @@
     </w:p>
     <w:sectPr>
       <w:pgSz w:w="15840" w:h="12240" w:orient="landscape"/>
-      <w:pgMar w:top="1440" w:right="1440" w:bottom="1440" w:left="1440" w:header="720" w:footer="720" w:gutter="0"/>
+      <w:pgMar w:top="720" w:right="720" w:bottom="720" w:left="720" w:header="720" w:footer="720" w:gutter="0"/>
       <w:cols w:space="720"/>
       <w:docGrid w:linePitch="360"/>
     </w:sectPr>

</xml_diff>